<commit_message>
new front pages are added
</commit_message>
<xml_diff>
--- a/front page.docx
+++ b/front page.docx
@@ -217,50 +217,14 @@
           <w:szCs w:val="32"/>
         </w:rPr>
       </w:pPr>
-      <w:proofErr w:type="gramStart"/>
-      <w:r>
-        <w:rPr>
-          <w:rFonts w:ascii="Times New Roman" w:hAnsi="Times New Roman" w:cs="Times New Roman"/>
-          <w:sz w:val="32"/>
-          <w:szCs w:val="32"/>
-        </w:rPr>
-        <w:t xml:space="preserve">( </w:t>
-      </w:r>
-      <w:r>
-        <w:rPr>
-          <w:rFonts w:ascii="Times New Roman" w:hAnsi="Times New Roman" w:cs="Times New Roman"/>
-          <w:sz w:val="32"/>
-          <w:szCs w:val="32"/>
-        </w:rPr>
-        <w:t>Web</w:t>
-      </w:r>
-      <w:proofErr w:type="gramEnd"/>
-      <w:r>
-        <w:rPr>
-          <w:rFonts w:ascii="Times New Roman" w:hAnsi="Times New Roman" w:cs="Times New Roman"/>
-          <w:sz w:val="32"/>
-          <w:szCs w:val="32"/>
-        </w:rPr>
-        <w:t xml:space="preserve"> </w:t>
-      </w:r>
-      <w:proofErr w:type="gramStart"/>
-      <w:r>
-        <w:rPr>
-          <w:rFonts w:ascii="Times New Roman" w:hAnsi="Times New Roman" w:cs="Times New Roman"/>
-          <w:sz w:val="32"/>
-          <w:szCs w:val="32"/>
-        </w:rPr>
-        <w:t>Technology</w:t>
-      </w:r>
-      <w:r>
-        <w:rPr>
-          <w:rFonts w:ascii="Times New Roman" w:hAnsi="Times New Roman" w:cs="Times New Roman"/>
-          <w:sz w:val="32"/>
-          <w:szCs w:val="32"/>
-        </w:rPr>
-        <w:t xml:space="preserve"> )</w:t>
-      </w:r>
-      <w:proofErr w:type="gramEnd"/>
+      <w:r>
+        <w:rPr>
+          <w:rFonts w:ascii="Times New Roman" w:hAnsi="Times New Roman" w:cs="Times New Roman"/>
+          <w:sz w:val="32"/>
+          <w:szCs w:val="32"/>
+        </w:rPr>
+        <w:t>()</w:t>
+      </w:r>
     </w:p>
     <w:p>
       <w:pPr>
@@ -495,17 +459,18 @@
           <w:szCs w:val="32"/>
           <w:lang w:val="en-US" w:eastAsia="zh-CN" w:bidi="ar"/>
         </w:rPr>
-        <w:t xml:space="preserve">Mr. </w:t>
-      </w:r>
-      <w:r>
-        <w:rPr>
-          <w:rFonts w:ascii="Times New Roman" w:hAnsi="Times New Roman"/>
-          <w:b/>
-          <w:bCs/>
-          <w:sz w:val="32"/>
-          <w:szCs w:val="32"/>
-        </w:rPr>
-        <w:t>Gyaneshwor Dhungana</w:t>
+        <w:t>Mr.</w:t>
+      </w:r>
+      <w:r>
+        <w:rPr>
+          <w:rFonts w:ascii="Times New Roman" w:eastAsia="SimSun" w:hAnsi="Times New Roman"/>
+          <w:b/>
+          <w:bCs/>
+          <w:sz w:val="32"/>
+          <w:szCs w:val="32"/>
+          <w:lang w:val="en-US" w:eastAsia="zh-CN" w:bidi="ar"/>
+        </w:rPr>
+        <w:t xml:space="preserve"> </w:t>
       </w:r>
     </w:p>
     <w:p>
@@ -626,6 +591,16 @@
           <w:szCs w:val="28"/>
         </w:rPr>
         <w:t>Roll No. 21</w:t>
+      </w:r>
+      <w:r>
+        <w:rPr>
+          <w:rFonts w:ascii="Times New Roman" w:hAnsi="Times New Roman" w:cs="Times New Roman"/>
+          <w:b/>
+          <w:bCs/>
+          <w:sz w:val="28"/>
+          <w:szCs w:val="28"/>
+        </w:rPr>
+        <w:t xml:space="preserve"> (80012149)</w:t>
       </w:r>
     </w:p>
     <w:p>
@@ -990,15 +965,7 @@
           <w:sz w:val="32"/>
           <w:szCs w:val="32"/>
         </w:rPr>
-        <w:t xml:space="preserve"> Year / </w:t>
-      </w:r>
-      <w:r>
-        <w:rPr>
-          <w:rFonts w:ascii="Times New Roman" w:hAnsi="Times New Roman" w:cs="Times New Roman"/>
-          <w:sz w:val="32"/>
-          <w:szCs w:val="32"/>
-        </w:rPr>
-        <w:t>5</w:t>
+        <w:t xml:space="preserve"> Year / 5</w:t>
       </w:r>
       <w:r>
         <w:rPr>

</xml_diff>

<commit_message>
sftware engineering lab report added
</commit_message>
<xml_diff>
--- a/front page.docx
+++ b/front page.docx
@@ -46,75 +46,6 @@
         </w:rPr>
         <w:t>Institute Of Science and Technology</w:t>
       </w:r>
-    </w:p>
-    <w:p>
-      <w:pPr>
-        <w:spacing w:line="360" w:lineRule="auto"/>
-        <w:jc w:val="center"/>
-        <w:rPr>
-          <w:rFonts w:ascii="Times New Roman" w:hAnsi="Times New Roman" w:cs="Times New Roman"/>
-          <w:b/>
-          <w:bCs/>
-          <w:sz w:val="28"/>
-          <w:szCs w:val="28"/>
-        </w:rPr>
-      </w:pPr>
-      <w:r>
-        <w:rPr>
-          <w:rFonts w:ascii="Times New Roman" w:hAnsi="Times New Roman" w:cs="Times New Roman"/>
-          <w:b/>
-          <w:bCs/>
-          <w:sz w:val="28"/>
-          <w:szCs w:val="28"/>
-        </w:rPr>
-        <w:t>Prithvi Narayan Campus</w:t>
-      </w:r>
-    </w:p>
-    <w:p>
-      <w:pPr>
-        <w:jc w:val="center"/>
-        <w:rPr>
-          <w:rFonts w:ascii="Times New Roman" w:hAnsi="Times New Roman" w:cs="Times New Roman"/>
-          <w:b/>
-          <w:bCs/>
-          <w:sz w:val="28"/>
-          <w:szCs w:val="28"/>
-        </w:rPr>
-      </w:pPr>
-      <w:proofErr w:type="spellStart"/>
-      <w:r>
-        <w:rPr>
-          <w:rFonts w:ascii="Times New Roman" w:hAnsi="Times New Roman" w:cs="Times New Roman"/>
-          <w:b/>
-          <w:bCs/>
-          <w:sz w:val="28"/>
-          <w:szCs w:val="28"/>
-        </w:rPr>
-        <w:t>BSc.CSIT</w:t>
-      </w:r>
-      <w:proofErr w:type="spellEnd"/>
-      <w:r>
-        <w:rPr>
-          <w:rFonts w:ascii="Times New Roman" w:hAnsi="Times New Roman" w:cs="Times New Roman"/>
-          <w:b/>
-          <w:bCs/>
-          <w:sz w:val="28"/>
-          <w:szCs w:val="28"/>
-        </w:rPr>
-        <w:t xml:space="preserve"> Program</w:t>
-      </w:r>
-    </w:p>
-    <w:p>
-      <w:pPr>
-        <w:jc w:val="center"/>
-        <w:rPr>
-          <w:rFonts w:ascii="Times New Roman" w:hAnsi="Times New Roman" w:cs="Times New Roman"/>
-          <w:b/>
-          <w:bCs/>
-          <w:sz w:val="28"/>
-          <w:szCs w:val="28"/>
-        </w:rPr>
-      </w:pPr>
     </w:p>
     <w:p>
       <w:pPr>
@@ -192,6 +123,95 @@
         <w:jc w:val="center"/>
         <w:rPr>
           <w:rFonts w:ascii="Times New Roman" w:hAnsi="Times New Roman" w:cs="Times New Roman"/>
+          <w:b/>
+          <w:bCs/>
+          <w:sz w:val="32"/>
+          <w:szCs w:val="32"/>
+        </w:rPr>
+      </w:pPr>
+      <w:r>
+        <w:rPr>
+          <w:rFonts w:ascii="Times New Roman" w:hAnsi="Times New Roman" w:cs="Times New Roman"/>
+          <w:b/>
+          <w:bCs/>
+          <w:sz w:val="32"/>
+          <w:szCs w:val="32"/>
+        </w:rPr>
+        <w:t>Prithvi Narayan Campus</w:t>
+      </w:r>
+    </w:p>
+    <w:p>
+      <w:pPr>
+        <w:jc w:val="center"/>
+        <w:rPr>
+          <w:rFonts w:ascii="Times New Roman" w:hAnsi="Times New Roman" w:cs="Times New Roman"/>
+          <w:b/>
+          <w:bCs/>
+          <w:sz w:val="28"/>
+          <w:szCs w:val="28"/>
+        </w:rPr>
+      </w:pPr>
+      <w:r>
+        <w:rPr>
+          <w:rFonts w:ascii="Times New Roman" w:hAnsi="Times New Roman" w:cs="Times New Roman"/>
+          <w:b/>
+          <w:bCs/>
+          <w:sz w:val="28"/>
+          <w:szCs w:val="28"/>
+        </w:rPr>
+        <w:t>BSc.</w:t>
+      </w:r>
+      <w:r>
+        <w:rPr>
+          <w:rFonts w:ascii="Times New Roman" w:hAnsi="Times New Roman" w:cs="Times New Roman"/>
+          <w:b/>
+          <w:bCs/>
+          <w:sz w:val="28"/>
+          <w:szCs w:val="28"/>
+        </w:rPr>
+        <w:t xml:space="preserve"> </w:t>
+      </w:r>
+      <w:r>
+        <w:rPr>
+          <w:rFonts w:ascii="Times New Roman" w:hAnsi="Times New Roman" w:cs="Times New Roman"/>
+          <w:b/>
+          <w:bCs/>
+          <w:sz w:val="28"/>
+          <w:szCs w:val="28"/>
+        </w:rPr>
+        <w:t>CSIT Program</w:t>
+      </w:r>
+    </w:p>
+    <w:p>
+      <w:pPr>
+        <w:jc w:val="center"/>
+        <w:rPr>
+          <w:rFonts w:ascii="Times New Roman" w:hAnsi="Times New Roman" w:cs="Times New Roman"/>
+          <w:b/>
+          <w:bCs/>
+          <w:sz w:val="28"/>
+          <w:szCs w:val="28"/>
+        </w:rPr>
+      </w:pPr>
+    </w:p>
+    <w:p>
+      <w:pPr>
+        <w:jc w:val="center"/>
+        <w:rPr>
+          <w:rFonts w:ascii="Times New Roman" w:hAnsi="Times New Roman" w:cs="Times New Roman"/>
+          <w:b/>
+          <w:bCs/>
+          <w:sz w:val="28"/>
+          <w:szCs w:val="28"/>
+        </w:rPr>
+      </w:pPr>
+    </w:p>
+    <w:p>
+      <w:pPr>
+        <w:spacing w:line="360" w:lineRule="auto"/>
+        <w:jc w:val="center"/>
+        <w:rPr>
+          <w:rFonts w:ascii="Times New Roman" w:hAnsi="Times New Roman" w:cs="Times New Roman"/>
           <w:sz w:val="36"/>
           <w:szCs w:val="36"/>
         </w:rPr>
@@ -204,7 +224,27 @@
           <w:sz w:val="36"/>
           <w:szCs w:val="36"/>
         </w:rPr>
-        <w:t>PRACTICAL REPORT</w:t>
+        <w:t xml:space="preserve">Lab </w:t>
+      </w:r>
+      <w:r>
+        <w:rPr>
+          <w:rFonts w:ascii="Times New Roman" w:hAnsi="Times New Roman" w:cs="Times New Roman"/>
+          <w:b/>
+          <w:bCs/>
+          <w:sz w:val="36"/>
+          <w:szCs w:val="36"/>
+        </w:rPr>
+        <w:t>R</w:t>
+      </w:r>
+      <w:r>
+        <w:rPr>
+          <w:rFonts w:ascii="Times New Roman" w:hAnsi="Times New Roman" w:cs="Times New Roman"/>
+          <w:b/>
+          <w:bCs/>
+          <w:sz w:val="36"/>
+          <w:szCs w:val="36"/>
+        </w:rPr>
+        <w:t>eport</w:t>
       </w:r>
     </w:p>
     <w:p>
@@ -223,7 +263,23 @@
           <w:sz w:val="32"/>
           <w:szCs w:val="32"/>
         </w:rPr>
-        <w:t>()</w:t>
+        <w:t>(</w:t>
+      </w:r>
+      <w:r>
+        <w:rPr>
+          <w:rFonts w:ascii="Times New Roman" w:hAnsi="Times New Roman" w:cs="Times New Roman"/>
+          <w:sz w:val="32"/>
+          <w:szCs w:val="32"/>
+        </w:rPr>
+        <w:t>Software Engineering</w:t>
+      </w:r>
+      <w:r>
+        <w:rPr>
+          <w:rFonts w:ascii="Times New Roman" w:hAnsi="Times New Roman" w:cs="Times New Roman"/>
+          <w:sz w:val="32"/>
+          <w:szCs w:val="32"/>
+        </w:rPr>
+        <w:t>)</w:t>
       </w:r>
     </w:p>
     <w:p>
@@ -246,9 +302,9 @@
         <mc:AlternateContent>
           <mc:Choice Requires="wpg">
             <w:drawing>
-              <wp:inline distT="0" distB="0" distL="114300" distR="114300" wp14:anchorId="14F76C33" wp14:editId="72FE9221">
+              <wp:inline distT="0" distB="0" distL="114300" distR="114300" wp14:anchorId="14F76C33" wp14:editId="5A4C71B0">
                 <wp:extent cx="767715" cy="1493520"/>
-                <wp:effectExtent l="15875" t="15875" r="16510" b="33655"/>
+                <wp:effectExtent l="12700" t="12700" r="32385" b="30480"/>
                 <wp:docPr id="2" name="Group 2"/>
                 <wp:cNvGraphicFramePr/>
                 <a:graphic xmlns:a="http://schemas.openxmlformats.org/drawingml/2006/main">
@@ -371,29 +427,18 @@
               </wp:inline>
             </w:drawing>
           </mc:Choice>
-          <mc:Fallback xmlns:wpsCustomData="http://www.wps.cn/officeDocument/2013/wpsCustomData">
+          <mc:Fallback>
             <w:pict>
-              <v:group id="_x0000_s1026" o:spid="_x0000_s1026" o:spt="203" style="height:117.6pt;width:60.45pt;" coordorigin="8641,3937" coordsize="1209,3390" o:gfxdata="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">
-                <o:lock v:ext="edit" aspectratio="f"/>
-                <v:line id="_x0000_s1026" o:spid="_x0000_s1026" o:spt="20" style="position:absolute;left:9227;top:3937;flip:x;height:3391;width:37;" filled="f" stroked="t" coordsize="21600,21600" o:gfxdata="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">
-                  <v:fill on="f" focussize="0,0"/>
-                  <v:stroke weight="2.5pt" color="#000000" joinstyle="round" endcap="round"/>
-                  <v:imagedata o:title=""/>
-                  <o:lock v:ext="edit" aspectratio="f"/>
+              <v:group w14:anchorId="21F2F6E7" id="Group 2" o:spid="_x0000_s1026" style="width:60.45pt;height:117.6pt;mso-position-horizontal-relative:char;mso-position-vertical-relative:line" coordorigin="8641,3937" coordsize="1209,3390" o:gfxdata="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">
+                <v:line id="Straight Connector 1" o:spid="_x0000_s1027" style="position:absolute;flip:x;visibility:visible;mso-wrap-style:square" from="9227,3937" to="9264,7328" o:connectortype="straight" o:gfxdata="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" strokeweight="2.5pt">
+                  <v:stroke endcap="round"/>
                 </v:line>
-                <v:line id="_x0000_s1026" o:spid="_x0000_s1026" o:spt="20" style="position:absolute;left:8641;top:4425;height:2415;width:30;" filled="f" stroked="t" coordsize="21600,21600" o:gfxdata="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">
-                  <v:fill on="f" focussize="0,0"/>
-                  <v:stroke weight="2.5pt" color="#000000" joinstyle="round" endcap="round"/>
-                  <v:imagedata o:title=""/>
-                  <o:lock v:ext="edit" aspectratio="f"/>
+                <v:line id="Straight Connector 3" o:spid="_x0000_s1028" style="position:absolute;visibility:visible;mso-wrap-style:square" from="8641,4425" to="8671,6840" o:connectortype="straight" o:gfxdata="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" strokeweight="2.5pt">
+                  <v:stroke endcap="round"/>
                 </v:line>
-                <v:line id="_x0000_s1026" o:spid="_x0000_s1026" o:spt="20" style="position:absolute;left:9820;top:4425;height:2415;width:30;" filled="f" stroked="t" coordsize="21600,21600" o:gfxdata="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">
-                  <v:fill on="f" focussize="0,0"/>
-                  <v:stroke weight="2.5pt" color="#000000" joinstyle="round" endcap="round"/>
-                  <v:imagedata o:title=""/>
-                  <o:lock v:ext="edit" aspectratio="f"/>
+                <v:line id="Straight Connector 5" o:spid="_x0000_s1029" style="position:absolute;visibility:visible;mso-wrap-style:square" from="9820,4425" to="9850,6840" o:connectortype="straight" o:gfxdata="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" strokeweight="2.5pt">
+                  <v:stroke endcap="round"/>
                 </v:line>
-                <w10:wrap type="none"/>
                 <w10:anchorlock/>
               </v:group>
             </w:pict>
@@ -459,7 +504,40 @@
           <w:szCs w:val="32"/>
           <w:lang w:val="en-US" w:eastAsia="zh-CN" w:bidi="ar"/>
         </w:rPr>
-        <w:t>Mr.</w:t>
+        <w:t>Mr</w:t>
+      </w:r>
+      <w:r>
+        <w:rPr>
+          <w:rFonts w:ascii="Times New Roman" w:eastAsia="SimSun" w:hAnsi="Times New Roman"/>
+          <w:b/>
+          <w:bCs/>
+          <w:sz w:val="32"/>
+          <w:szCs w:val="32"/>
+          <w:lang w:val="en-US" w:eastAsia="zh-CN" w:bidi="ar"/>
+        </w:rPr>
+        <w:t>s</w:t>
+      </w:r>
+      <w:r>
+        <w:rPr>
+          <w:rFonts w:ascii="Times New Roman" w:eastAsia="SimSun" w:hAnsi="Times New Roman"/>
+          <w:b/>
+          <w:bCs/>
+          <w:sz w:val="32"/>
+          <w:szCs w:val="32"/>
+          <w:lang w:val="en-US" w:eastAsia="zh-CN" w:bidi="ar"/>
+        </w:rPr>
+        <w:t>.</w:t>
+      </w:r>
+      <w:r>
+        <w:rPr>
+          <w:rFonts w:ascii="Times New Roman" w:eastAsia="SimSun" w:hAnsi="Times New Roman"/>
+          <w:b/>
+          <w:bCs/>
+          <w:sz w:val="32"/>
+          <w:szCs w:val="32"/>
+          <w:lang w:val="en-US" w:eastAsia="zh-CN" w:bidi="ar"/>
+        </w:rPr>
+        <w:t xml:space="preserve"> Nilam Thapa</w:t>
       </w:r>
       <w:r>
         <w:rPr>
@@ -895,19 +973,6 @@
     </w:tbl>
     <w:p>
       <w:pPr>
-        <w:jc w:val="center"/>
-        <w:rPr>
-          <w:rFonts w:ascii="Times New Roman" w:hAnsi="Times New Roman" w:cs="Times New Roman"/>
-          <w:b/>
-          <w:bCs/>
-          <w:sz w:val="32"/>
-          <w:szCs w:val="32"/>
-        </w:rPr>
-      </w:pPr>
-    </w:p>
-    <w:p>
-      <w:pPr>
-        <w:jc w:val="center"/>
         <w:rPr>
           <w:rFonts w:ascii="Times New Roman" w:hAnsi="Times New Roman" w:cs="Times New Roman"/>
           <w:b/>
@@ -925,7 +990,6 @@
     </w:p>
     <w:p>
       <w:pPr>
-        <w:jc w:val="center"/>
         <w:rPr>
           <w:rFonts w:ascii="Times New Roman" w:hAnsi="Times New Roman" w:cs="Times New Roman"/>
           <w:b/>

</xml_diff>